<commit_message>
separa state do pescador do state da colonia e limpa lixo de template
DocumentData: headquarter_state passa a sair em STATE2, liberando STATE
para o estado do pescador. Antes o array_merge sobrescrevia STATE com o
valor da colonia, entao os 22 documentos de endereco do pescador
mostravam MG em vez do estado real.

Templates da familia de filiacao passam a usar ${STATE2}:
filiacao, dec_filiacao_nao_alfabetizado, dec_filiacao, dec_filiacao_nao_alfabetizado(velho) e termo2.

guia_3 e guia_4 corrigidos de ${ADDICIONAL} para ${ADICIONAL}, que e a
chave que o PHP injeta. Era a unica macro orfa que restava no projeto.

residencia_propria_new: ${ISSUER} para ${RG_ISSUER}.
termo_info_previdenciarias: ${CITY_HALL} para ${CITY}, o municipio passa
a ser o do pescador.

Removidos .~lock.filiacao.docx#, ~$cibo_1.docx e filiacao.odt: lock file
do Word e versao antiga em ODT, sem nenhuma referencia no sistema.
</commit_message>
<xml_diff>
--- a/resources/templates/dec_filiacao.docx
+++ b/resources/templates/dec_filiacao.docx
@@ -1166,7 +1166,7 @@
                                 <w:rFonts w:ascii="Arial" w:eastAsia="Arial" w:hAnsi="Arial" w:cs="Arial"/>
                                 <w:color w:val="000000"/>
                               </w:rPr>
-                              <w:t>${STATE}</w:t>
+                              <w:t>${STATE2}</w:t>
                             </w:r>
                           </w:p>
                         </w:txbxContent>
@@ -1195,7 +1195,7 @@
                           <w:rFonts w:ascii="Arial" w:eastAsia="Arial" w:hAnsi="Arial" w:cs="Arial"/>
                           <w:color w:val="000000"/>
                         </w:rPr>
-                        <w:t>${STATE}</w:t>
+                        <w:t>${STATE2}</w:t>
                       </w:r>
                     </w:p>
                   </w:txbxContent>

</xml_diff>